<commit_message>
Firm identity: SEC-registered corporation (CS201511875), lean team by design
Co-Authored-By: Claude Fable 5 <noreply@anthropic.com>
</commit_message>
<xml_diff>
--- a/docs/cv/krcl/files/KRCL-CV-C40-QC-NBS.docx
+++ b/docs/cv/krcl/files/KRCL-CV-C40-QC-NBS.docx
@@ -321,7 +321,7 @@
                 <w:b w:val="0"/>
                 <w:sz w:val="20"/>
               </w:rPr>
-              <w:t>Name of Firm:  Post 205, Inc. (POST205)</w:t>
+              <w:t>Name of Firm:  Post 205, Inc. (POST205) — Philippine corporation, SEC Registration No. CS201511875 (2015)</w:t>
             </w:r>
           </w:p>
         </w:tc>
@@ -1686,7 +1686,7 @@
                 <w:b w:val="0"/>
                 <w:sz w:val="20"/>
               </w:rPr>
-              <w:t>Positions held:  Founder &amp; President (custom web systems, back-office platforms, and payment/compliance systems for Philippine businesses)</w:t>
+              <w:t>Positions held:  Founder &amp; President (leads a lean team building custom web systems, back-office platforms, and payment/compliance systems for Philippine businesses; the named consultant performs the build work directly)</w:t>
             </w:r>
           </w:p>
         </w:tc>

</xml_diff>

<commit_message>
Skip boot/decode when homepage is framed; add WLEM Academy to associations
Framed previews were stalling the rAF-driven boot, leaving the headline
mid-decode. Framed visits now render resolved instantly.

Co-Authored-By: Claude Fable 5 <noreply@anthropic.com>
</commit_message>
<xml_diff>
--- a/docs/cv/krcl/files/KRCL-CV-C40-QC-NBS.docx
+++ b/docs/cv/krcl/files/KRCL-CV-C40-QC-NBS.docx
@@ -731,6 +731,15 @@
                 <w:sz w:val="20"/>
               </w:rPr>
               <w:t>BNI (Business Network International), Taguig Region, Philippines — member since 2018; Vice President and Membership Committee Chair, 2025; multiple chapter leadership positions over eight consecutive years.</w:t>
+            </w:r>
+          </w:p>
+          <w:p>
+            <w:r>
+              <w:rPr>
+                <w:b w:val="0"/>
+                <w:sz w:val="20"/>
+              </w:rPr>
+              <w:t>Work Less, Earn More (WLEM) Academy — Expert Consultant network, since 2024.</w:t>
             </w:r>
           </w:p>
         </w:tc>

</xml_diff>

<commit_message>
Work undertaken: add SMPC cooperative finance portal + current engagements; SMPC bullet on Piandré card
Co-Authored-By: Claude Fable 5 <noreply@anthropic.com>
</commit_message>
<xml_diff>
--- a/docs/cv/krcl/files/KRCL-CV-C40-QC-NBS.docx
+++ b/docs/cv/krcl/files/KRCL-CV-C40-QC-NBS.docx
@@ -2890,6 +2890,131 @@
               <w:t>•  Run them daily as POST205's own back office — the systems sold are the systems used</w:t>
             </w:r>
           </w:p>
+          <w:p>
+            <w:r>
+              <w:rPr>
+                <w:b w:val="0"/>
+                <w:sz w:val="20"/>
+              </w:rPr>
+            </w:r>
+          </w:p>
+          <w:p>
+            <w:r>
+              <w:rPr>
+                <w:b/>
+                <w:sz w:val="20"/>
+              </w:rPr>
+              <w:t>Name of assignment or project:  Cooperative finance portal — Salon Multi-Purpose Cooperative (SMPC)</w:t>
+            </w:r>
+          </w:p>
+          <w:p>
+            <w:r>
+              <w:rPr>
+                <w:b w:val="0"/>
+                <w:sz w:val="20"/>
+              </w:rPr>
+              <w:t>Year:  2026 (ongoing)</w:t>
+            </w:r>
+          </w:p>
+          <w:p>
+            <w:r>
+              <w:rPr>
+                <w:b w:val="0"/>
+                <w:sz w:val="20"/>
+              </w:rPr>
+              <w:t>Location:  Metro Manila, Philippines</w:t>
+            </w:r>
+          </w:p>
+          <w:p>
+            <w:r>
+              <w:rPr>
+                <w:b w:val="0"/>
+                <w:sz w:val="20"/>
+              </w:rPr>
+              <w:t>Client:  Salon Multi-Purpose Cooperative (Piandré employees' cooperative)</w:t>
+            </w:r>
+          </w:p>
+          <w:p>
+            <w:r>
+              <w:rPr>
+                <w:b w:val="0"/>
+                <w:sz w:val="20"/>
+              </w:rPr>
+              <w:t>Main project features:</w:t>
+            </w:r>
+          </w:p>
+          <w:p>
+            <w:r>
+              <w:rPr>
+                <w:b w:val="0"/>
+                <w:sz w:val="20"/>
+              </w:rPr>
+              <w:t>•  Web rebuild of the cooperative's legacy MS Access system (smpc.piandre.com)</w:t>
+            </w:r>
+          </w:p>
+          <w:p>
+            <w:r>
+              <w:rPr>
+                <w:b w:val="0"/>
+                <w:sz w:val="20"/>
+              </w:rPr>
+              <w:t>•  Share-capital ledgers built from salary deductions; loans against share capital; year-end dividends</w:t>
+            </w:r>
+          </w:p>
+          <w:p>
+            <w:r>
+              <w:rPr>
+                <w:b w:val="0"/>
+                <w:sz w:val="20"/>
+              </w:rPr>
+              <w:t>•  Loan-eligibility computation and approval workflow encoded auditably, replacing a single-person manual process</w:t>
+            </w:r>
+          </w:p>
+          <w:p>
+            <w:r>
+              <w:rPr>
+                <w:b w:val="0"/>
+                <w:sz w:val="20"/>
+              </w:rPr>
+              <w:t>•  Row-level security isolating cooperative financial data inside a shared database</w:t>
+            </w:r>
+          </w:p>
+          <w:p>
+            <w:r>
+              <w:rPr>
+                <w:b w:val="0"/>
+                <w:sz w:val="20"/>
+              </w:rPr>
+              <w:t>Positions held:  Founder &amp; Lead Engineer, POST205</w:t>
+            </w:r>
+          </w:p>
+          <w:p>
+            <w:r>
+              <w:rPr>
+                <w:b w:val="0"/>
+                <w:sz w:val="20"/>
+              </w:rPr>
+              <w:t>Activities performed:</w:t>
+            </w:r>
+          </w:p>
+          <w:p>
+            <w:r>
+              <w:rPr>
+                <w:b w:val="0"/>
+                <w:sz w:val="20"/>
+              </w:rPr>
+              <w:t>•  Designed the financial data model and security policies</w:t>
+            </w:r>
+          </w:p>
+          <w:p>
+            <w:r>
+              <w:rPr>
+                <w:b w:val="0"/>
+                <w:sz w:val="20"/>
+              </w:rPr>
+              <w:t>•  Encoding the eligibility rules and approval workflow with the cooperative's officers</w:t>
+            </w:r>
+          </w:p>
         </w:tc>
       </w:tr>
       <w:tr>
@@ -3690,6 +3815,131 @@
                 <w:sz w:val="20"/>
               </w:rPr>
               <w:t>•  Built reusable patterns (secure submissions, member admin) now shared across projects</w:t>
+            </w:r>
+          </w:p>
+          <w:p>
+            <w:r>
+              <w:rPr>
+                <w:b w:val="0"/>
+                <w:sz w:val="20"/>
+              </w:rPr>
+            </w:r>
+          </w:p>
+          <w:p>
+            <w:r>
+              <w:rPr>
+                <w:b/>
+                <w:sz w:val="20"/>
+              </w:rPr>
+              <w:t>Name of assignment or project:  Current engagements (in build)</w:t>
+            </w:r>
+          </w:p>
+          <w:p>
+            <w:r>
+              <w:rPr>
+                <w:b w:val="0"/>
+                <w:sz w:val="20"/>
+              </w:rPr>
+              <w:t>Year:  2026</w:t>
+            </w:r>
+          </w:p>
+          <w:p>
+            <w:r>
+              <w:rPr>
+                <w:b w:val="0"/>
+                <w:sz w:val="20"/>
+              </w:rPr>
+              <w:t>Location:  Metro Manila / Pasig / Palawan, Philippines</w:t>
+            </w:r>
+          </w:p>
+          <w:p>
+            <w:r>
+              <w:rPr>
+                <w:b w:val="0"/>
+                <w:sz w:val="20"/>
+              </w:rPr>
+              <w:t>Client:  Various (engagements in progress)</w:t>
+            </w:r>
+          </w:p>
+          <w:p>
+            <w:r>
+              <w:rPr>
+                <w:b w:val="0"/>
+                <w:sz w:val="20"/>
+              </w:rPr>
+              <w:t>Main project features:</w:t>
+            </w:r>
+          </w:p>
+          <w:p>
+            <w:r>
+              <w:rPr>
+                <w:b w:val="0"/>
+                <w:sz w:val="20"/>
+              </w:rPr>
+              <w:t>•  StagePro (events equipment): asset registry with depreciation tracking and resale workflow</w:t>
+            </w:r>
+          </w:p>
+          <w:p>
+            <w:r>
+              <w:rPr>
+                <w:b w:val="0"/>
+                <w:sz w:val="20"/>
+              </w:rPr>
+              <w:t>•  Creative Learning School, Inc. (Pasig): school website rebuild and back office — dashboard, teacher console, attendance encoding</w:t>
+            </w:r>
+          </w:p>
+          <w:p>
+            <w:r>
+              <w:rPr>
+                <w:b w:val="0"/>
+                <w:sz w:val="20"/>
+              </w:rPr>
+              <w:t>•  Little Way Playschool: preschool front-office system</w:t>
+            </w:r>
+          </w:p>
+          <w:p>
+            <w:r>
+              <w:rPr>
+                <w:b w:val="0"/>
+                <w:sz w:val="20"/>
+              </w:rPr>
+              <w:t>•  Serenity Shores (wellness facility): website and guided intake</w:t>
+            </w:r>
+          </w:p>
+          <w:p>
+            <w:r>
+              <w:rPr>
+                <w:b w:val="0"/>
+                <w:sz w:val="20"/>
+              </w:rPr>
+              <w:t>•  AI systems consultancy: paid System Mapping Sessions for Philippine businesses (post205.com/mapping)</w:t>
+            </w:r>
+          </w:p>
+          <w:p>
+            <w:r>
+              <w:rPr>
+                <w:b w:val="0"/>
+                <w:sz w:val="20"/>
+              </w:rPr>
+              <w:t>Positions held:  Founder &amp; Lead Engineer, POST205</w:t>
+            </w:r>
+          </w:p>
+          <w:p>
+            <w:r>
+              <w:rPr>
+                <w:b w:val="0"/>
+                <w:sz w:val="20"/>
+              </w:rPr>
+              <w:t>Activities performed:</w:t>
+            </w:r>
+          </w:p>
+          <w:p>
+            <w:r>
+              <w:rPr>
+                <w:b w:val="0"/>
+                <w:sz w:val="20"/>
+              </w:rPr>
+              <w:t>•  Concurrent design and build across the engagements above, on the same production stack</w:t>
             </w:r>
           </w:p>
         </w:tc>

</xml_diff>

<commit_message>
Section 10: detailed assignments for CLSI, StagePro, Serenity Shores, Little Way, and the mapping consultancy; retire the in-build strip
Co-Authored-By: Claude Fable 5 <noreply@anthropic.com>
</commit_message>
<xml_diff>
--- a/docs/cv/krcl/files/KRCL-CV-C40-QC-NBS.docx
+++ b/docs/cv/krcl/files/KRCL-CV-C40-QC-NBS.docx
@@ -3662,6 +3662,113 @@
               <w:t>•  Built and deployed the platform; migrated legacy article archives</w:t>
             </w:r>
           </w:p>
+          <w:p>
+            <w:r>
+              <w:rPr>
+                <w:b w:val="0"/>
+                <w:sz w:val="20"/>
+              </w:rPr>
+            </w:r>
+          </w:p>
+          <w:p>
+            <w:r>
+              <w:rPr>
+                <w:b/>
+                <w:sz w:val="20"/>
+              </w:rPr>
+              <w:t>Name of assignment or project:  Community platforms — alumni and association systems</w:t>
+            </w:r>
+          </w:p>
+          <w:p>
+            <w:r>
+              <w:rPr>
+                <w:b w:val="0"/>
+                <w:sz w:val="20"/>
+              </w:rPr>
+              <w:t>Year:  2025–2026</w:t>
+            </w:r>
+          </w:p>
+          <w:p>
+            <w:r>
+              <w:rPr>
+                <w:b w:val="0"/>
+                <w:sz w:val="20"/>
+              </w:rPr>
+              <w:t>Location:  Metro Manila, Philippines</w:t>
+            </w:r>
+          </w:p>
+          <w:p>
+            <w:r>
+              <w:rPr>
+                <w:b w:val="0"/>
+                <w:sz w:val="20"/>
+              </w:rPr>
+              <w:t>Client:  Ateneo HS 2001 alumni association (01bigfight); Poveda 2002 (povedans.com); BNI chapter (all-stars)</w:t>
+            </w:r>
+          </w:p>
+          <w:p>
+            <w:r>
+              <w:rPr>
+                <w:b w:val="0"/>
+                <w:sz w:val="20"/>
+              </w:rPr>
+              <w:t>Main project features:</w:t>
+            </w:r>
+          </w:p>
+          <w:p>
+            <w:r>
+              <w:rPr>
+                <w:b w:val="0"/>
+                <w:sz w:val="20"/>
+              </w:rPr>
+              <w:t>•  Alumni pledge and homecoming platforms with payments and email confirmation</w:t>
+            </w:r>
+          </w:p>
+          <w:p>
+            <w:r>
+              <w:rPr>
+                <w:b w:val="0"/>
+                <w:sz w:val="20"/>
+              </w:rPr>
+              <w:t>•  Association member directory, analytics, and role-based admin systems</w:t>
+            </w:r>
+          </w:p>
+          <w:p>
+            <w:r>
+              <w:rPr>
+                <w:b w:val="0"/>
+                <w:sz w:val="20"/>
+              </w:rPr>
+              <w:t>Positions held:  Founder &amp; Lead Engineer, POST205</w:t>
+            </w:r>
+          </w:p>
+          <w:p>
+            <w:r>
+              <w:rPr>
+                <w:b w:val="0"/>
+                <w:sz w:val="20"/>
+              </w:rPr>
+              <w:t>Activities performed:</w:t>
+            </w:r>
+          </w:p>
+          <w:p>
+            <w:r>
+              <w:rPr>
+                <w:b w:val="0"/>
+                <w:sz w:val="20"/>
+              </w:rPr>
+              <w:t>•  Designed and shipped each platform end to end</w:t>
+            </w:r>
+          </w:p>
+          <w:p>
+            <w:r>
+              <w:rPr>
+                <w:b w:val="0"/>
+                <w:sz w:val="20"/>
+              </w:rPr>
+              <w:t>•  Built reusable patterns (secure submissions, member admin) now shared across projects</w:t>
+            </w:r>
+          </w:p>
         </w:tc>
       </w:tr>
       <w:tr>
@@ -3724,16 +3831,141 @@
                 <w:b/>
                 <w:sz w:val="20"/>
               </w:rPr>
-              <w:t>Name of assignment or project:  Community platforms — alumni and association systems</w:t>
-            </w:r>
-          </w:p>
-          <w:p>
-            <w:r>
-              <w:rPr>
-                <w:b w:val="0"/>
-                <w:sz w:val="20"/>
-              </w:rPr>
-              <w:t>Year:  2025–2026</w:t>
+              <w:t>Name of assignment or project:  School back office &amp; website — Creative Learning School, Inc. (CLSI)</w:t>
+            </w:r>
+          </w:p>
+          <w:p>
+            <w:r>
+              <w:rPr>
+                <w:b w:val="0"/>
+                <w:sz w:val="20"/>
+              </w:rPr>
+              <w:t>Year:  2026 (in build)</w:t>
+            </w:r>
+          </w:p>
+          <w:p>
+            <w:r>
+              <w:rPr>
+                <w:b w:val="0"/>
+                <w:sz w:val="20"/>
+              </w:rPr>
+              <w:t>Location:  Pasig City, Philippines</w:t>
+            </w:r>
+          </w:p>
+          <w:p>
+            <w:r>
+              <w:rPr>
+                <w:b w:val="0"/>
+                <w:sz w:val="20"/>
+              </w:rPr>
+              <w:t>Client:  Creative Learning School, Inc. (private preparatory school, est. 1988)</w:t>
+            </w:r>
+          </w:p>
+          <w:p>
+            <w:r>
+              <w:rPr>
+                <w:b w:val="0"/>
+                <w:sz w:val="20"/>
+              </w:rPr>
+              <w:t>Main project features:</w:t>
+            </w:r>
+          </w:p>
+          <w:p>
+            <w:r>
+              <w:rPr>
+                <w:b w:val="0"/>
+                <w:sz w:val="20"/>
+              </w:rPr>
+              <w:t>•  Website rebuild plus a working school command center: dashboard (enrollment, attendance, academic standing on DepEd descriptors, collections)</w:t>
+            </w:r>
+          </w:p>
+          <w:p>
+            <w:r>
+              <w:rPr>
+                <w:b w:val="0"/>
+                <w:sz w:val="20"/>
+              </w:rPr>
+              <w:t>•  Teacher console with class-scoped access, student watchlist, and per-student 360 view (grades, attendance, tuition)</w:t>
+            </w:r>
+          </w:p>
+          <w:p>
+            <w:r>
+              <w:rPr>
+                <w:b w:val="0"/>
+                <w:sz w:val="20"/>
+              </w:rPr>
+              <w:t>•  One-tap attendance and grade encoding that feeds DepEd forms (SF1/SF2, SF9/SF10) through to report cards and the dashboard</w:t>
+            </w:r>
+          </w:p>
+          <w:p>
+            <w:r>
+              <w:rPr>
+                <w:b w:val="0"/>
+                <w:sz w:val="20"/>
+              </w:rPr>
+              <w:t>•  Concept system runs on synthetic data, designed for RA 10173 (Data Privacy Act) compliance</w:t>
+            </w:r>
+          </w:p>
+          <w:p>
+            <w:r>
+              <w:rPr>
+                <w:b w:val="0"/>
+                <w:sz w:val="20"/>
+              </w:rPr>
+              <w:t>Positions held:  Founder &amp; Lead Engineer, POST205</w:t>
+            </w:r>
+          </w:p>
+          <w:p>
+            <w:r>
+              <w:rPr>
+                <w:b w:val="0"/>
+                <w:sz w:val="20"/>
+              </w:rPr>
+              <w:t>Activities performed:</w:t>
+            </w:r>
+          </w:p>
+          <w:p>
+            <w:r>
+              <w:rPr>
+                <w:b w:val="0"/>
+                <w:sz w:val="20"/>
+              </w:rPr>
+              <w:t>•  Built the website rebuild and the three back-office surfaces (dashboard, teacher console, encoder)</w:t>
+            </w:r>
+          </w:p>
+          <w:p>
+            <w:r>
+              <w:rPr>
+                <w:b w:val="0"/>
+                <w:sz w:val="20"/>
+              </w:rPr>
+              <w:t>•  Designed the phased build: report-card generation, GCash-native billing, online re-enrollment</w:t>
+            </w:r>
+          </w:p>
+          <w:p>
+            <w:r>
+              <w:rPr>
+                <w:b w:val="0"/>
+                <w:sz w:val="20"/>
+              </w:rPr>
+            </w:r>
+          </w:p>
+          <w:p>
+            <w:r>
+              <w:rPr>
+                <w:b/>
+                <w:sz w:val="20"/>
+              </w:rPr>
+              <w:t>Name of assignment or project:  Asset registry &amp; resale system — StagePro (events equipment)</w:t>
+            </w:r>
+          </w:p>
+          <w:p>
+            <w:r>
+              <w:rPr>
+                <w:b w:val="0"/>
+                <w:sz w:val="20"/>
+              </w:rPr>
+              <w:t>Year:  2026 (in build)</w:t>
             </w:r>
           </w:p>
           <w:p>
@@ -3751,7 +3983,7 @@
                 <w:b w:val="0"/>
                 <w:sz w:val="20"/>
               </w:rPr>
-              <w:t>Client:  Ateneo HS 2001 alumni association (01bigfight); Poveda 2002 (povedans.com); BNI chapter (all-stars)</w:t>
+              <w:t>Client:  StagePro, Inc. (lights, sound, and staging equipment)</w:t>
             </w:r>
           </w:p>
           <w:p>
@@ -3769,16 +4001,34 @@
                 <w:b w:val="0"/>
                 <w:sz w:val="20"/>
               </w:rPr>
-              <w:t>•  Alumni pledge and homecoming platforms with payments and email confirmation</w:t>
-            </w:r>
-          </w:p>
-          <w:p>
-            <w:r>
-              <w:rPr>
-                <w:b w:val="0"/>
-                <w:sz w:val="20"/>
-              </w:rPr>
-              <w:t>•  Association member directory, analytics, and role-based admin systems</w:t>
+              <w:t>•  Asset register tagged by depreciation profile: keep/in-service versus sell/liquidate</w:t>
+            </w:r>
+          </w:p>
+          <w:p>
+            <w:r>
+              <w:rPr>
+                <w:b w:val="0"/>
+                <w:sz w:val="20"/>
+              </w:rPr>
+              <w:t>•  Depreciation tracking over time — declining book value, age, sell-by dates</w:t>
+            </w:r>
+          </w:p>
+          <w:p>
+            <w:r>
+              <w:rPr>
+                <w:b w:val="0"/>
+                <w:sz w:val="20"/>
+              </w:rPr>
+              <w:t>•  Private resale board shared with specific buyers through unguessable per-buyer links</w:t>
+            </w:r>
+          </w:p>
+          <w:p>
+            <w:r>
+              <w:rPr>
+                <w:b w:val="0"/>
+                <w:sz w:val="20"/>
+              </w:rPr>
+              <w:t>•  Proposal engine, crew roster, and scheduling in the fuller system design</w:t>
             </w:r>
           </w:p>
           <w:p>
@@ -3805,16 +4055,16 @@
                 <w:b w:val="0"/>
                 <w:sz w:val="20"/>
               </w:rPr>
-              <w:t>•  Designed and shipped each platform end to end</w:t>
-            </w:r>
-          </w:p>
-          <w:p>
-            <w:r>
-              <w:rPr>
-                <w:b w:val="0"/>
-                <w:sz w:val="20"/>
-              </w:rPr>
-              <w:t>•  Built reusable patterns (secure submissions, member admin) now shared across projects</w:t>
+              <w:t>•  Designed the system from the owner's stated problem: capital depreciating in idle equipment</w:t>
+            </w:r>
+          </w:p>
+          <w:p>
+            <w:r>
+              <w:rPr>
+                <w:b w:val="0"/>
+                <w:sz w:val="20"/>
+              </w:rPr>
+              <w:t>•  Demonstrated the full back office as a working system before engagement</w:t>
             </w:r>
           </w:p>
           <w:p>
@@ -3831,34 +4081,34 @@
                 <w:b/>
                 <w:sz w:val="20"/>
               </w:rPr>
-              <w:t>Name of assignment or project:  Current engagements (in build)</w:t>
-            </w:r>
-          </w:p>
-          <w:p>
-            <w:r>
-              <w:rPr>
-                <w:b w:val="0"/>
-                <w:sz w:val="20"/>
-              </w:rPr>
-              <w:t>Year:  2026</w:t>
-            </w:r>
-          </w:p>
-          <w:p>
-            <w:r>
-              <w:rPr>
-                <w:b w:val="0"/>
-                <w:sz w:val="20"/>
-              </w:rPr>
-              <w:t>Location:  Metro Manila / Pasig / Palawan, Philippines</w:t>
-            </w:r>
-          </w:p>
-          <w:p>
-            <w:r>
-              <w:rPr>
-                <w:b w:val="0"/>
-                <w:sz w:val="20"/>
-              </w:rPr>
-              <w:t>Client:  Various (engagements in progress)</w:t>
+              <w:t>Name of assignment or project:  Guided-intake website — Serenity Shores (destination recovery, Palawan)</w:t>
+            </w:r>
+          </w:p>
+          <w:p>
+            <w:r>
+              <w:rPr>
+                <w:b w:val="0"/>
+                <w:sz w:val="20"/>
+              </w:rPr>
+              <w:t>Year:  2026 (in build)</w:t>
+            </w:r>
+          </w:p>
+          <w:p>
+            <w:r>
+              <w:rPr>
+                <w:b w:val="0"/>
+                <w:sz w:val="20"/>
+              </w:rPr>
+              <w:t>Location:  El Nido, Palawan, Philippines</w:t>
+            </w:r>
+          </w:p>
+          <w:p>
+            <w:r>
+              <w:rPr>
+                <w:b w:val="0"/>
+                <w:sz w:val="20"/>
+              </w:rPr>
+              <w:t>Client:  Serenity Shores (destination-recovery sanctuary)</w:t>
             </w:r>
           </w:p>
           <w:p>
@@ -3876,43 +4126,25 @@
                 <w:b w:val="0"/>
                 <w:sz w:val="20"/>
               </w:rPr>
-              <w:t>•  StagePro (events equipment): asset registry with depreciation tracking and resale workflow</w:t>
-            </w:r>
-          </w:p>
-          <w:p>
-            <w:r>
-              <w:rPr>
-                <w:b w:val="0"/>
-                <w:sz w:val="20"/>
-              </w:rPr>
-              <w:t>•  Creative Learning School, Inc. (Pasig): school website rebuild and back office — dashboard, teacher console, attendance encoding</w:t>
-            </w:r>
-          </w:p>
-          <w:p>
-            <w:r>
-              <w:rPr>
-                <w:b w:val="0"/>
-                <w:sz w:val="20"/>
-              </w:rPr>
-              <w:t>•  Little Way Playschool: preschool front-office system</w:t>
-            </w:r>
-          </w:p>
-          <w:p>
-            <w:r>
-              <w:rPr>
-                <w:b w:val="0"/>
-                <w:sz w:val="20"/>
-              </w:rPr>
-              <w:t>•  Serenity Shores (wellness facility): website and guided intake</w:t>
-            </w:r>
-          </w:p>
-          <w:p>
-            <w:r>
-              <w:rPr>
-                <w:b w:val="0"/>
-                <w:sz w:val="20"/>
-              </w:rPr>
-              <w:t>•  AI systems consultancy: paid System Mapping Sessions for Philippine businesses (post205.com/mapping)</w:t>
+              <w:t>•  Website with a conversational concierge intake: scripted question spine with guardrailed AI reflection</w:t>
+            </w:r>
+          </w:p>
+          <w:p>
+            <w:r>
+              <w:rPr>
+                <w:b w:val="0"/>
+                <w:sz w:val="20"/>
+              </w:rPr>
+              <w:t>•  Secure serverless write path — no anonymous database inserts; row-level security throughout</w:t>
+            </w:r>
+          </w:p>
+          <w:p>
+            <w:r>
+              <w:rPr>
+                <w:b w:val="0"/>
+                <w:sz w:val="20"/>
+              </w:rPr>
+              <w:t>•  Crisis-safety and claim-safety rules engineered into the copy and conversation design</w:t>
             </w:r>
           </w:p>
           <w:p>
@@ -3939,7 +4171,212 @@
                 <w:b w:val="0"/>
                 <w:sz w:val="20"/>
               </w:rPr>
-              <w:t>•  Concurrent design and build across the engagements above, on the same production stack</w:t>
+              <w:t>•  Built the site and the concierge conversation engine</w:t>
+            </w:r>
+          </w:p>
+          <w:p>
+            <w:r>
+              <w:rPr>
+                <w:b w:val="0"/>
+                <w:sz w:val="20"/>
+              </w:rPr>
+              <w:t>•  Designed the safety guardrails governing what the system may and may not say</w:t>
+            </w:r>
+          </w:p>
+          <w:p>
+            <w:r>
+              <w:rPr>
+                <w:b w:val="0"/>
+                <w:sz w:val="20"/>
+              </w:rPr>
+            </w:r>
+          </w:p>
+          <w:p>
+            <w:r>
+              <w:rPr>
+                <w:b/>
+                <w:sz w:val="20"/>
+              </w:rPr>
+              <w:t>Name of assignment or project:  Preschool website &amp; front office — Little Way Playschool</w:t>
+            </w:r>
+          </w:p>
+          <w:p>
+            <w:r>
+              <w:rPr>
+                <w:b w:val="0"/>
+                <w:sz w:val="20"/>
+              </w:rPr>
+              <w:t>Year:  2026 (in build)</w:t>
+            </w:r>
+          </w:p>
+          <w:p>
+            <w:r>
+              <w:rPr>
+                <w:b w:val="0"/>
+                <w:sz w:val="20"/>
+              </w:rPr>
+              <w:t>Location:  Metro Manila, Philippines</w:t>
+            </w:r>
+          </w:p>
+          <w:p>
+            <w:r>
+              <w:rPr>
+                <w:b w:val="0"/>
+                <w:sz w:val="20"/>
+              </w:rPr>
+              <w:t>Client:  Little Way Playschool</w:t>
+            </w:r>
+          </w:p>
+          <w:p>
+            <w:r>
+              <w:rPr>
+                <w:b w:val="0"/>
+                <w:sz w:val="20"/>
+              </w:rPr>
+              <w:t>Main project features:</w:t>
+            </w:r>
+          </w:p>
+          <w:p>
+            <w:r>
+              <w:rPr>
+                <w:b w:val="0"/>
+                <w:sz w:val="20"/>
+              </w:rPr>
+              <w:t>•  School website (programs, early years, getting started, inquiries)</w:t>
+            </w:r>
+          </w:p>
+          <w:p>
+            <w:r>
+              <w:rPr>
+                <w:b w:val="0"/>
+                <w:sz w:val="20"/>
+              </w:rPr>
+              <w:t>•  Front-office system for inquiries through enrollment</w:t>
+            </w:r>
+          </w:p>
+          <w:p>
+            <w:r>
+              <w:rPr>
+                <w:b w:val="0"/>
+                <w:sz w:val="20"/>
+              </w:rPr>
+              <w:t>Positions held:  Founder &amp; Lead Engineer, POST205</w:t>
+            </w:r>
+          </w:p>
+          <w:p>
+            <w:r>
+              <w:rPr>
+                <w:b w:val="0"/>
+                <w:sz w:val="20"/>
+              </w:rPr>
+              <w:t>Activities performed:</w:t>
+            </w:r>
+          </w:p>
+          <w:p>
+            <w:r>
+              <w:rPr>
+                <w:b w:val="0"/>
+                <w:sz w:val="20"/>
+              </w:rPr>
+              <w:t>•  Building the site and front office as one system</w:t>
+            </w:r>
+          </w:p>
+          <w:p>
+            <w:r>
+              <w:rPr>
+                <w:b w:val="0"/>
+                <w:sz w:val="20"/>
+              </w:rPr>
+            </w:r>
+          </w:p>
+          <w:p>
+            <w:r>
+              <w:rPr>
+                <w:b/>
+                <w:sz w:val="20"/>
+              </w:rPr>
+              <w:t>Name of assignment or project:  AI systems consultancy — System Mapping Sessions</w:t>
+            </w:r>
+          </w:p>
+          <w:p>
+            <w:r>
+              <w:rPr>
+                <w:b w:val="0"/>
+                <w:sz w:val="20"/>
+              </w:rPr>
+              <w:t>Year:  2026 (ongoing)</w:t>
+            </w:r>
+          </w:p>
+          <w:p>
+            <w:r>
+              <w:rPr>
+                <w:b w:val="0"/>
+                <w:sz w:val="20"/>
+              </w:rPr>
+              <w:t>Location:  Philippines</w:t>
+            </w:r>
+          </w:p>
+          <w:p>
+            <w:r>
+              <w:rPr>
+                <w:b w:val="0"/>
+                <w:sz w:val="20"/>
+              </w:rPr>
+              <w:t>Client:  Philippine SMEs (paid engagements via post205.com/mapping)</w:t>
+            </w:r>
+          </w:p>
+          <w:p>
+            <w:r>
+              <w:rPr>
+                <w:b w:val="0"/>
+                <w:sz w:val="20"/>
+              </w:rPr>
+              <w:t>Main project features:</w:t>
+            </w:r>
+          </w:p>
+          <w:p>
+            <w:r>
+              <w:rPr>
+                <w:b w:val="0"/>
+                <w:sz w:val="20"/>
+              </w:rPr>
+              <w:t>•  A paid working session that maps every manual workflow in a business, prices each one per year, and delivers a one-page plan of what to automate first</w:t>
+            </w:r>
+          </w:p>
+          <w:p>
+            <w:r>
+              <w:rPr>
+                <w:b w:val="0"/>
+                <w:sz w:val="20"/>
+              </w:rPr>
+              <w:t>•  Session fee credited against a subsequent build engagement</w:t>
+            </w:r>
+          </w:p>
+          <w:p>
+            <w:r>
+              <w:rPr>
+                <w:b w:val="0"/>
+                <w:sz w:val="20"/>
+              </w:rPr>
+              <w:t>Positions held:  Consultant, POST205</w:t>
+            </w:r>
+          </w:p>
+          <w:p>
+            <w:r>
+              <w:rPr>
+                <w:b w:val="0"/>
+                <w:sz w:val="20"/>
+              </w:rPr>
+              <w:t>Activities performed:</w:t>
+            </w:r>
+          </w:p>
+          <w:p>
+            <w:r>
+              <w:rPr>
+                <w:b w:val="0"/>
+                <w:sz w:val="20"/>
+              </w:rPr>
+              <w:t>•  Runs the sessions personally; findings feed directly into system design</w:t>
             </w:r>
           </w:p>
         </w:tc>

</xml_diff>

<commit_message>
Remove the C40 demo from Work Undertaken (circular as a credential for this tender)
Co-Authored-By: Claude Fable 5 <noreply@anthropic.com>
</commit_message>
<xml_diff>
--- a/docs/cv/krcl/files/KRCL-CV-C40-QC-NBS.docx
+++ b/docs/cv/krcl/files/KRCL-CV-C40-QC-NBS.docx
@@ -2417,131 +2417,6 @@
                 <w:u w:val="single"/>
               </w:rPr>
             </w:pPr>
-            <w:r>
-              <w:rPr>
-                <w:b/>
-                <w:sz w:val="20"/>
-              </w:rPr>
-              <w:t>Name of assignment or project:  Nature-based data demonstration platform — C40 “Creating a Baseline for Nature-based Data in Quezon City” proposal</w:t>
-            </w:r>
-          </w:p>
-          <w:p>
-            <w:r>
-              <w:rPr>
-                <w:b w:val="0"/>
-                <w:sz w:val="20"/>
-              </w:rPr>
-              <w:t>Year:  2026</w:t>
-            </w:r>
-          </w:p>
-          <w:p>
-            <w:r>
-              <w:rPr>
-                <w:b w:val="0"/>
-                <w:sz w:val="20"/>
-              </w:rPr>
-              <w:t>Location:  Quezon City, Philippines</w:t>
-            </w:r>
-          </w:p>
-          <w:p>
-            <w:r>
-              <w:rPr>
-                <w:b w:val="0"/>
-                <w:sz w:val="20"/>
-              </w:rPr>
-              <w:t>Client:  Consortium proposal (with lead environmental planning firm)</w:t>
-            </w:r>
-          </w:p>
-          <w:p>
-            <w:r>
-              <w:rPr>
-                <w:b w:val="0"/>
-                <w:sz w:val="20"/>
-              </w:rPr>
-              <w:t>Main project features:</w:t>
-            </w:r>
-          </w:p>
-          <w:p>
-            <w:r>
-              <w:rPr>
-                <w:b w:val="0"/>
-                <w:sz w:val="20"/>
-              </w:rPr>
-              <w:t>•  Interactive 3D city map (vector tiles, building extrusion, pitched camera) presenting nature-based data layers</w:t>
-            </w:r>
-          </w:p>
-          <w:p>
-            <w:r>
-              <w:rPr>
-                <w:b w:val="0"/>
-                <w:sz w:val="20"/>
-              </w:rPr>
-              <w:t>•  Dashboard views over a geospatial data store (PostgreSQL/PostGIS), with a QGIS/ArcGIS–to–GeoJSON file-update path for post-project maintenance</w:t>
-            </w:r>
-          </w:p>
-          <w:p>
-            <w:r>
-              <w:rPr>
-                <w:b w:val="0"/>
-                <w:sz w:val="20"/>
-              </w:rPr>
-              <w:t>•  Static-microsite delivery architecture: no backend and zero recurring hosting cost after turnover, designed for institutional succession</w:t>
-            </w:r>
-          </w:p>
-          <w:p>
-            <w:r>
-              <w:rPr>
-                <w:b w:val="0"/>
-                <w:sz w:val="20"/>
-              </w:rPr>
-              <w:t>Positions held:  Technology Lead — Web Systems &amp; Data Platforms</w:t>
-            </w:r>
-          </w:p>
-          <w:p>
-            <w:r>
-              <w:rPr>
-                <w:b w:val="0"/>
-                <w:sz w:val="20"/>
-              </w:rPr>
-              <w:t>Activities performed:</w:t>
-            </w:r>
-          </w:p>
-          <w:p>
-            <w:r>
-              <w:rPr>
-                <w:b w:val="0"/>
-                <w:sz w:val="20"/>
-              </w:rPr>
-              <w:t>•  Designed the platform architecture and succession model</w:t>
-            </w:r>
-          </w:p>
-          <w:p>
-            <w:r>
-              <w:rPr>
-                <w:b w:val="0"/>
-                <w:sz w:val="20"/>
-              </w:rPr>
-              <w:t>•  Built the working demonstration site: map engine, data layers, and dashboard</w:t>
-            </w:r>
-          </w:p>
-          <w:p>
-            <w:r>
-              <w:rPr>
-                <w:b w:val="0"/>
-                <w:sz w:val="20"/>
-              </w:rPr>
-              <w:t>•  Authored the technology methodology and turnover plan integrated into the proposal</w:t>
-            </w:r>
-          </w:p>
-          <w:p>
-            <w:r>
-              <w:rPr>
-                <w:b w:val="0"/>
-                <w:sz w:val="20"/>
-              </w:rPr>
-            </w:r>
-          </w:p>
-          <w:p>
             <w:r>
               <w:rPr>
                 <w:b/>

</xml_diff>